<commit_message>
feat: Dashboard estilo RL Tracker, sección Análisis y visor Ballchasing embebido
- Dashboard rediseñado con gráficos personales (estilo de juego, goles vs
  tiros, forma reciente) y filtros por modo/periodo/resultado
- Nueva sección Análisis (/analysis) con comparativa victorias vs derrotas
  y frente a compañeros/rivales, con drill-down y evolución temporal
- Router stats.py: /dashboard, /analysis, /trend, /glossary, /analysis/filters
- Visor embebido de Ballchasing (WebContentsView) en Electron
- Documentación actualizada: README, docs *.md y los dos documentos Word

Co-Authored-By: Claude Opus 4.7 <noreply@anthropic.com>
</commit_message>
<xml_diff>
--- a/docs/RLAnalyzer_Docs_Tecnica.docx
+++ b/docs/RLAnalyzer_Docs_Tecnica.docx
@@ -86,7 +86,7 @@
           <w:sz w:val="22"/>
           <w:szCs w:val="22"/>
         </w:rPr>
-        <w:t xml:space="preserve">Versión 0.1  ·  Mayo 2026</w:t>
+        <w:t xml:space="preserve">Versión 0.3  ·  Mayo 2026</w:t>
       </w:r>
     </w:p>
     <w:p>
@@ -210,7 +210,7 @@
           <w:sz w:val="22"/>
           <w:szCs w:val="22"/>
         </w:rPr>
-        <w:t xml:space="preserve">Dashboard con resumen de victorias, derrotas, win rate y últimas partidas</w:t>
+        <w:t xml:space="preserve">Dashboard con KPIs (victorias, derrotas, win rate) y gráficos personales estilo RL Tracker (estilo de juego, goles vs tiros, forma reciente) con filtros por modo, periodo y resultado</w:t>
       </w:r>
     </w:p>
     <w:p>
@@ -306,6 +306,82 @@
           <w:szCs w:val="22"/>
         </w:rPr>
         <w:t xml:space="preserve">Iconos de rango locales (PNG) que no dependen de conexión a internet</w:t>
+      </w:r>
+    </w:p>
+    <w:p>
+      <w:pPr>
+        <w:pStyle w:val="ListParagraph"/>
+        <w:numPr>
+          <w:ilvl w:val="0"/>
+          <w:numId w:val="2"/>
+        </w:numPr>
+        <w:spacing w:after="40" w:before="40"/>
+      </w:pPr>
+      <w:r>
+        <w:rPr>
+          <w:rFonts w:ascii="Arial" w:cs="Arial" w:eastAsia="Arial" w:hAnsi="Arial"/>
+          <w:color w:val="222222"/>
+          <w:sz w:val="22"/>
+          <w:szCs w:val="22"/>
+        </w:rPr>
+        <w:t xml:space="preserve">Sección de Análisis: comparativa de tus medias en victorias vs derrotas y frente a compañeros y rivales, con desglose «¿Por qué?» mediante métricas relacionadas y evolución temporal</w:t>
+      </w:r>
+    </w:p>
+    <w:p>
+      <w:pPr>
+        <w:pStyle w:val="ListParagraph"/>
+        <w:numPr>
+          <w:ilvl w:val="0"/>
+          <w:numId w:val="2"/>
+        </w:numPr>
+        <w:spacing w:after="40" w:before="40"/>
+      </w:pPr>
+      <w:r>
+        <w:rPr>
+          <w:rFonts w:ascii="Arial" w:cs="Arial" w:eastAsia="Arial" w:hAnsi="Arial"/>
+          <w:color w:val="222222"/>
+          <w:sz w:val="22"/>
+          <w:szCs w:val="22"/>
+        </w:rPr>
+        <w:t xml:space="preserve">Visor 3D interactivo de replays (Three.js): campo bicolor, coches con etiquetas, balón, efectos de gol y timeline; además visor embebido de Ballchasing</w:t>
+      </w:r>
+    </w:p>
+    <w:p>
+      <w:pPr>
+        <w:pStyle w:val="ListParagraph"/>
+        <w:numPr>
+          <w:ilvl w:val="0"/>
+          <w:numId w:val="2"/>
+        </w:numPr>
+        <w:spacing w:after="40" w:before="40"/>
+      </w:pPr>
+      <w:r>
+        <w:rPr>
+          <w:rFonts w:ascii="Arial" w:cs="Arial" w:eastAsia="Arial" w:hAnsi="Arial"/>
+          <w:color w:val="222222"/>
+          <w:sz w:val="22"/>
+          <w:szCs w:val="22"/>
+        </w:rPr>
+        <w:t xml:space="preserve">Historial por jugador: récord con/contra cualquier jugador visto en tus partidas (win rate y medias comparadas)</w:t>
+      </w:r>
+    </w:p>
+    <w:p>
+      <w:pPr>
+        <w:pStyle w:val="ListParagraph"/>
+        <w:numPr>
+          <w:ilvl w:val="0"/>
+          <w:numId w:val="2"/>
+        </w:numPr>
+        <w:spacing w:after="40" w:before="40"/>
+      </w:pPr>
+      <w:r>
+        <w:rPr>
+          <w:rFonts w:ascii="Arial" w:cs="Arial" w:eastAsia="Arial" w:hAnsi="Arial"/>
+          <w:color w:val="222222"/>
+          <w:sz w:val="22"/>
+          <w:szCs w:val="22"/>
+        </w:rPr>
+        <w:t xml:space="preserve">Aplicación de escritorio con Electron: ventana nativa de Windows sin necesidad de abrir el navegador</w:t>
       </w:r>
     </w:p>
     <w:p>
@@ -1961,6 +2037,190 @@
           </w:p>
         </w:tc>
       </w:tr>
+      <w:tr>
+        <w:tc>
+          <w:tcPr>
+            <w:tcW w:type="dxa" w:w="3000"/>
+            <w:tcBorders>
+              <w:top w:val="single" w:color="CCDDEE" w:sz="1"/>
+              <w:left w:val="single" w:color="CCDDEE" w:sz="1"/>
+              <w:bottom w:val="single" w:color="CCDDEE" w:sz="1"/>
+              <w:right w:val="single" w:color="CCDDEE" w:sz="1"/>
+            </w:tcBorders>
+            <w:shd w:fill="FFFFFF" w:val="clear"/>
+            <w:tcMar>
+              <w:top w:type="dxa" w:w="80"/>
+              <w:left w:type="dxa" w:w="160"/>
+              <w:bottom w:type="dxa" w:w="80"/>
+              <w:right w:type="dxa" w:w="160"/>
+            </w:tcMar>
+            <w:vAlign w:val="center"/>
+          </w:tcPr>
+          <w:p>
+            <w:r>
+              <w:rPr>
+                <w:rFonts w:ascii="Arial" w:cs="Arial" w:eastAsia="Arial" w:hAnsi="Arial"/>
+                <w:color w:val="111111"/>
+                <w:sz w:val="20"/>
+                <w:szCs w:val="20"/>
+              </w:rPr>
+              <w:t xml:space="preserve">rrrocket</w:t>
+            </w:r>
+          </w:p>
+        </w:tc>
+        <w:tc>
+          <w:tcPr>
+            <w:tcW w:type="dxa" w:w="1500"/>
+            <w:tcBorders>
+              <w:top w:val="single" w:color="CCDDEE" w:sz="1"/>
+              <w:left w:val="single" w:color="CCDDEE" w:sz="1"/>
+              <w:bottom w:val="single" w:color="CCDDEE" w:sz="1"/>
+              <w:right w:val="single" w:color="CCDDEE" w:sz="1"/>
+            </w:tcBorders>
+            <w:shd w:fill="FFFFFF" w:val="clear"/>
+            <w:tcMar>
+              <w:top w:type="dxa" w:w="80"/>
+              <w:left w:type="dxa" w:w="160"/>
+              <w:bottom w:type="dxa" w:w="80"/>
+              <w:right w:type="dxa" w:w="160"/>
+            </w:tcMar>
+            <w:vAlign w:val="center"/>
+          </w:tcPr>
+          <w:p>
+            <w:r>
+              <w:rPr>
+                <w:rFonts w:ascii="Arial" w:cs="Arial" w:eastAsia="Arial" w:hAnsi="Arial"/>
+                <w:color w:val="111111"/>
+                <w:sz w:val="20"/>
+                <w:szCs w:val="20"/>
+              </w:rPr>
+              <w:t xml:space="preserve">latest</w:t>
+            </w:r>
+          </w:p>
+        </w:tc>
+        <w:tc>
+          <w:tcPr>
+            <w:tcW w:type="dxa" w:w="4860"/>
+            <w:tcBorders>
+              <w:top w:val="single" w:color="CCDDEE" w:sz="1"/>
+              <w:left w:val="single" w:color="CCDDEE" w:sz="1"/>
+              <w:bottom w:val="single" w:color="CCDDEE" w:sz="1"/>
+              <w:right w:val="single" w:color="CCDDEE" w:sz="1"/>
+            </w:tcBorders>
+            <w:shd w:fill="FFFFFF" w:val="clear"/>
+            <w:tcMar>
+              <w:top w:type="dxa" w:w="80"/>
+              <w:left w:type="dxa" w:w="160"/>
+              <w:bottom w:type="dxa" w:w="80"/>
+              <w:right w:type="dxa" w:w="160"/>
+            </w:tcMar>
+            <w:vAlign w:val="center"/>
+          </w:tcPr>
+          <w:p>
+            <w:r>
+              <w:rPr>
+                <w:rFonts w:ascii="Arial" w:cs="Arial" w:eastAsia="Arial" w:hAnsi="Arial"/>
+                <w:color w:val="111111"/>
+                <w:sz w:val="20"/>
+                <w:szCs w:val="20"/>
+              </w:rPr>
+              <w:t xml:space="preserve">Parser de network frames del replay para el visor 3D (tools/rrrocket.exe)</w:t>
+            </w:r>
+          </w:p>
+        </w:tc>
+      </w:tr>
+      <w:tr>
+        <w:tc>
+          <w:tcPr>
+            <w:tcW w:type="dxa" w:w="3000"/>
+            <w:tcBorders>
+              <w:top w:val="single" w:color="CCDDEE" w:sz="1"/>
+              <w:left w:val="single" w:color="CCDDEE" w:sz="1"/>
+              <w:bottom w:val="single" w:color="CCDDEE" w:sz="1"/>
+              <w:right w:val="single" w:color="CCDDEE" w:sz="1"/>
+            </w:tcBorders>
+            <w:shd w:fill="FFFFFF" w:val="clear"/>
+            <w:tcMar>
+              <w:top w:type="dxa" w:w="80"/>
+              <w:left w:type="dxa" w:w="160"/>
+              <w:bottom w:type="dxa" w:w="80"/>
+              <w:right w:type="dxa" w:w="160"/>
+            </w:tcMar>
+            <w:vAlign w:val="center"/>
+          </w:tcPr>
+          <w:p>
+            <w:r>
+              <w:rPr>
+                <w:rFonts w:ascii="Arial" w:cs="Arial" w:eastAsia="Arial" w:hAnsi="Arial"/>
+                <w:color w:val="111111"/>
+                <w:sz w:val="20"/>
+                <w:szCs w:val="20"/>
+              </w:rPr>
+              <w:t xml:space="preserve">Playwright</w:t>
+            </w:r>
+          </w:p>
+        </w:tc>
+        <w:tc>
+          <w:tcPr>
+            <w:tcW w:type="dxa" w:w="1500"/>
+            <w:tcBorders>
+              <w:top w:val="single" w:color="CCDDEE" w:sz="1"/>
+              <w:left w:val="single" w:color="CCDDEE" w:sz="1"/>
+              <w:bottom w:val="single" w:color="CCDDEE" w:sz="1"/>
+              <w:right w:val="single" w:color="CCDDEE" w:sz="1"/>
+            </w:tcBorders>
+            <w:shd w:fill="FFFFFF" w:val="clear"/>
+            <w:tcMar>
+              <w:top w:type="dxa" w:w="80"/>
+              <w:left w:type="dxa" w:w="160"/>
+              <w:bottom w:type="dxa" w:w="80"/>
+              <w:right w:type="dxa" w:w="160"/>
+            </w:tcMar>
+            <w:vAlign w:val="center"/>
+          </w:tcPr>
+          <w:p>
+            <w:r>
+              <w:rPr>
+                <w:rFonts w:ascii="Arial" w:cs="Arial" w:eastAsia="Arial" w:hAnsi="Arial"/>
+                <w:color w:val="111111"/>
+                <w:sz w:val="20"/>
+                <w:szCs w:val="20"/>
+              </w:rPr>
+              <w:t xml:space="preserve">1.x</w:t>
+            </w:r>
+          </w:p>
+        </w:tc>
+        <w:tc>
+          <w:tcPr>
+            <w:tcW w:type="dxa" w:w="4860"/>
+            <w:tcBorders>
+              <w:top w:val="single" w:color="CCDDEE" w:sz="1"/>
+              <w:left w:val="single" w:color="CCDDEE" w:sz="1"/>
+              <w:bottom w:val="single" w:color="CCDDEE" w:sz="1"/>
+              <w:right w:val="single" w:color="CCDDEE" w:sz="1"/>
+            </w:tcBorders>
+            <w:shd w:fill="FFFFFF" w:val="clear"/>
+            <w:tcMar>
+              <w:top w:type="dxa" w:w="80"/>
+              <w:left w:type="dxa" w:w="160"/>
+              <w:bottom w:type="dxa" w:w="80"/>
+              <w:right w:type="dxa" w:w="160"/>
+            </w:tcMar>
+            <w:vAlign w:val="center"/>
+          </w:tcPr>
+          <w:p>
+            <w:r>
+              <w:rPr>
+                <w:rFonts w:ascii="Arial" w:cs="Arial" w:eastAsia="Arial" w:hAnsi="Arial"/>
+                <w:color w:val="111111"/>
+                <w:sz w:val="20"/>
+                <w:szCs w:val="20"/>
+              </w:rPr>
+              <w:t xml:space="preserve">Navegador Chromium headless: fallback del perfil tracker.gg</w:t>
+            </w:r>
+          </w:p>
+        </w:tc>
+      </w:tr>
     </w:tbl>
     <w:p>
       <w:pPr>
@@ -2666,6 +2926,190 @@
           </w:p>
         </w:tc>
       </w:tr>
+      <w:tr>
+        <w:tc>
+          <w:tcPr>
+            <w:tcW w:type="dxa" w:w="3000"/>
+            <w:tcBorders>
+              <w:top w:val="single" w:color="CCDDEE" w:sz="1"/>
+              <w:left w:val="single" w:color="CCDDEE" w:sz="1"/>
+              <w:bottom w:val="single" w:color="CCDDEE" w:sz="1"/>
+              <w:right w:val="single" w:color="CCDDEE" w:sz="1"/>
+            </w:tcBorders>
+            <w:shd w:fill="FFFFFF" w:val="clear"/>
+            <w:tcMar>
+              <w:top w:type="dxa" w:w="80"/>
+              <w:left w:type="dxa" w:w="160"/>
+              <w:bottom w:type="dxa" w:w="80"/>
+              <w:right w:type="dxa" w:w="160"/>
+            </w:tcMar>
+            <w:vAlign w:val="center"/>
+          </w:tcPr>
+          <w:p>
+            <w:r>
+              <w:rPr>
+                <w:rFonts w:ascii="Arial" w:cs="Arial" w:eastAsia="Arial" w:hAnsi="Arial"/>
+                <w:color w:val="111111"/>
+                <w:sz w:val="20"/>
+                <w:szCs w:val="20"/>
+              </w:rPr>
+              <w:t xml:space="preserve">Three.js</w:t>
+            </w:r>
+          </w:p>
+        </w:tc>
+        <w:tc>
+          <w:tcPr>
+            <w:tcW w:type="dxa" w:w="1500"/>
+            <w:tcBorders>
+              <w:top w:val="single" w:color="CCDDEE" w:sz="1"/>
+              <w:left w:val="single" w:color="CCDDEE" w:sz="1"/>
+              <w:bottom w:val="single" w:color="CCDDEE" w:sz="1"/>
+              <w:right w:val="single" w:color="CCDDEE" w:sz="1"/>
+            </w:tcBorders>
+            <w:shd w:fill="FFFFFF" w:val="clear"/>
+            <w:tcMar>
+              <w:top w:type="dxa" w:w="80"/>
+              <w:left w:type="dxa" w:w="160"/>
+              <w:bottom w:type="dxa" w:w="80"/>
+              <w:right w:type="dxa" w:w="160"/>
+            </w:tcMar>
+            <w:vAlign w:val="center"/>
+          </w:tcPr>
+          <w:p>
+            <w:r>
+              <w:rPr>
+                <w:rFonts w:ascii="Arial" w:cs="Arial" w:eastAsia="Arial" w:hAnsi="Arial"/>
+                <w:color w:val="111111"/>
+                <w:sz w:val="20"/>
+                <w:szCs w:val="20"/>
+              </w:rPr>
+              <w:t xml:space="preserve">0.16x</w:t>
+            </w:r>
+          </w:p>
+        </w:tc>
+        <w:tc>
+          <w:tcPr>
+            <w:tcW w:type="dxa" w:w="4860"/>
+            <w:tcBorders>
+              <w:top w:val="single" w:color="CCDDEE" w:sz="1"/>
+              <w:left w:val="single" w:color="CCDDEE" w:sz="1"/>
+              <w:bottom w:val="single" w:color="CCDDEE" w:sz="1"/>
+              <w:right w:val="single" w:color="CCDDEE" w:sz="1"/>
+            </w:tcBorders>
+            <w:shd w:fill="FFFFFF" w:val="clear"/>
+            <w:tcMar>
+              <w:top w:type="dxa" w:w="80"/>
+              <w:left w:type="dxa" w:w="160"/>
+              <w:bottom w:type="dxa" w:w="80"/>
+              <w:right w:type="dxa" w:w="160"/>
+            </w:tcMar>
+            <w:vAlign w:val="center"/>
+          </w:tcPr>
+          <w:p>
+            <w:r>
+              <w:rPr>
+                <w:rFonts w:ascii="Arial" w:cs="Arial" w:eastAsia="Arial" w:hAnsi="Arial"/>
+                <w:color w:val="111111"/>
+                <w:sz w:val="20"/>
+                <w:szCs w:val="20"/>
+              </w:rPr>
+              <w:t xml:space="preserve">Render 3D del visor de replays (escena, cámara, OrbitControls)</w:t>
+            </w:r>
+          </w:p>
+        </w:tc>
+      </w:tr>
+      <w:tr>
+        <w:tc>
+          <w:tcPr>
+            <w:tcW w:type="dxa" w:w="3000"/>
+            <w:tcBorders>
+              <w:top w:val="single" w:color="CCDDEE" w:sz="1"/>
+              <w:left w:val="single" w:color="CCDDEE" w:sz="1"/>
+              <w:bottom w:val="single" w:color="CCDDEE" w:sz="1"/>
+              <w:right w:val="single" w:color="CCDDEE" w:sz="1"/>
+            </w:tcBorders>
+            <w:shd w:fill="FFFFFF" w:val="clear"/>
+            <w:tcMar>
+              <w:top w:type="dxa" w:w="80"/>
+              <w:left w:type="dxa" w:w="160"/>
+              <w:bottom w:type="dxa" w:w="80"/>
+              <w:right w:type="dxa" w:w="160"/>
+            </w:tcMar>
+            <w:vAlign w:val="center"/>
+          </w:tcPr>
+          <w:p>
+            <w:r>
+              <w:rPr>
+                <w:rFonts w:ascii="Arial" w:cs="Arial" w:eastAsia="Arial" w:hAnsi="Arial"/>
+                <w:color w:val="111111"/>
+                <w:sz w:val="20"/>
+                <w:szCs w:val="20"/>
+              </w:rPr>
+              <w:t xml:space="preserve">Electron</w:t>
+            </w:r>
+          </w:p>
+        </w:tc>
+        <w:tc>
+          <w:tcPr>
+            <w:tcW w:type="dxa" w:w="1500"/>
+            <w:tcBorders>
+              <w:top w:val="single" w:color="CCDDEE" w:sz="1"/>
+              <w:left w:val="single" w:color="CCDDEE" w:sz="1"/>
+              <w:bottom w:val="single" w:color="CCDDEE" w:sz="1"/>
+              <w:right w:val="single" w:color="CCDDEE" w:sz="1"/>
+            </w:tcBorders>
+            <w:shd w:fill="FFFFFF" w:val="clear"/>
+            <w:tcMar>
+              <w:top w:type="dxa" w:w="80"/>
+              <w:left w:type="dxa" w:w="160"/>
+              <w:bottom w:type="dxa" w:w="80"/>
+              <w:right w:type="dxa" w:w="160"/>
+            </w:tcMar>
+            <w:vAlign w:val="center"/>
+          </w:tcPr>
+          <w:p>
+            <w:r>
+              <w:rPr>
+                <w:rFonts w:ascii="Arial" w:cs="Arial" w:eastAsia="Arial" w:hAnsi="Arial"/>
+                <w:color w:val="111111"/>
+                <w:sz w:val="20"/>
+                <w:szCs w:val="20"/>
+              </w:rPr>
+              <w:t xml:space="preserve">3x</w:t>
+            </w:r>
+          </w:p>
+        </w:tc>
+        <w:tc>
+          <w:tcPr>
+            <w:tcW w:type="dxa" w:w="4860"/>
+            <w:tcBorders>
+              <w:top w:val="single" w:color="CCDDEE" w:sz="1"/>
+              <w:left w:val="single" w:color="CCDDEE" w:sz="1"/>
+              <w:bottom w:val="single" w:color="CCDDEE" w:sz="1"/>
+              <w:right w:val="single" w:color="CCDDEE" w:sz="1"/>
+            </w:tcBorders>
+            <w:shd w:fill="FFFFFF" w:val="clear"/>
+            <w:tcMar>
+              <w:top w:type="dxa" w:w="80"/>
+              <w:left w:type="dxa" w:w="160"/>
+              <w:bottom w:type="dxa" w:w="80"/>
+              <w:right w:type="dxa" w:w="160"/>
+            </w:tcMar>
+            <w:vAlign w:val="center"/>
+          </w:tcPr>
+          <w:p>
+            <w:r>
+              <w:rPr>
+                <w:rFonts w:ascii="Arial" w:cs="Arial" w:eastAsia="Arial" w:hAnsi="Arial"/>
+                <w:color w:val="111111"/>
+                <w:sz w:val="20"/>
+                <w:szCs w:val="20"/>
+              </w:rPr>
+              <w:t xml:space="preserve">Empaqueta la app como escritorio (ventana nativa, IPC)</w:t>
+            </w:r>
+          </w:p>
+        </w:tc>
+      </w:tr>
     </w:tbl>
     <w:p>
       <w:pPr>
@@ -5978,6 +6422,22 @@
           <w:sz w:val="16"/>
           <w:szCs w:val="16"/>
         </w:rPr>
+        <w:t xml:space="preserve">      │   ├── GET /api/replays/{id}/frames   [frames 3D del visor]</w:t>
+      </w:r>
+    </w:p>
+    <w:p>
+      <w:pPr>
+        <w:shd w:fill="F0F8FF" w:val="clear"/>
+        <w:spacing w:after="0" w:before="0"/>
+        <w:ind w:left="200" w:right="200"/>
+      </w:pPr>
+      <w:r>
+        <w:rPr>
+          <w:rFonts w:ascii="Courier New" w:cs="Courier New" w:eastAsia="Courier New" w:hAnsi="Courier New"/>
+          <w:color w:val="1A4A7A"/>
+          <w:sz w:val="16"/>
+          <w:szCs w:val="16"/>
+        </w:rPr>
         <w:t xml:space="preserve">      │   ├── GET /api/stats/summary     [KPIs globales]</w:t>
       </w:r>
     </w:p>
@@ -6011,6 +6471,230 @@
           <w:szCs w:val="16"/>
         </w:rPr>
         <w:t xml:space="preserve">      │   └── GET /api/status            [estado del watcher]</w:t>
+      </w:r>
+    </w:p>
+    <w:p>
+      <w:pPr>
+        <w:shd w:fill="F0F8FF" w:val="clear"/>
+        <w:spacing w:after="0" w:before="0"/>
+        <w:ind w:left="200" w:right="200"/>
+      </w:pPr>
+      <w:r>
+        <w:rPr>
+          <w:rFonts w:ascii="Courier New" w:cs="Courier New" w:eastAsia="Courier New" w:hAnsi="Courier New"/>
+          <w:color w:val="1A4A7A"/>
+          <w:sz w:val="16"/>
+          <w:szCs w:val="16"/>
+        </w:rPr>
+        <w:t xml:space="preserve">      │</w:t>
+      </w:r>
+    </w:p>
+    <w:p>
+      <w:pPr>
+        <w:shd w:fill="F0F8FF" w:val="clear"/>
+        <w:spacing w:after="0" w:before="0"/>
+        <w:ind w:left="200" w:right="200"/>
+      </w:pPr>
+      <w:r>
+        <w:rPr>
+          <w:rFonts w:ascii="Courier New" w:cs="Courier New" w:eastAsia="Courier New" w:hAnsi="Courier New"/>
+          <w:color w:val="1A4A7A"/>
+          <w:sz w:val="16"/>
+          <w:szCs w:val="16"/>
+        </w:rPr>
+        <w:t xml:space="preserve">      ├── stats.py</w:t>
+      </w:r>
+    </w:p>
+    <w:p>
+      <w:pPr>
+        <w:shd w:fill="F0F8FF" w:val="clear"/>
+        <w:spacing w:after="0" w:before="0"/>
+        <w:ind w:left="200" w:right="200"/>
+      </w:pPr>
+      <w:r>
+        <w:rPr>
+          <w:rFonts w:ascii="Courier New" w:cs="Courier New" w:eastAsia="Courier New" w:hAnsi="Courier New"/>
+          <w:color w:val="1A4A7A"/>
+          <w:sz w:val="16"/>
+          <w:szCs w:val="16"/>
+        </w:rPr>
+        <w:t xml:space="preserve">      │   ├── GET /api/stats/dashboard   [datos del Dashboard]</w:t>
+      </w:r>
+    </w:p>
+    <w:p>
+      <w:pPr>
+        <w:shd w:fill="F0F8FF" w:val="clear"/>
+        <w:spacing w:after="0" w:before="0"/>
+        <w:ind w:left="200" w:right="200"/>
+      </w:pPr>
+      <w:r>
+        <w:rPr>
+          <w:rFonts w:ascii="Courier New" w:cs="Courier New" w:eastAsia="Courier New" w:hAnsi="Courier New"/>
+          <w:color w:val="1A4A7A"/>
+          <w:sz w:val="16"/>
+          <w:szCs w:val="16"/>
+        </w:rPr>
+        <w:t xml:space="preserve">      │   ├── GET /api/stats/analysis    [comparativa V/D y roles]</w:t>
+      </w:r>
+    </w:p>
+    <w:p>
+      <w:pPr>
+        <w:shd w:fill="F0F8FF" w:val="clear"/>
+        <w:spacing w:after="0" w:before="0"/>
+        <w:ind w:left="200" w:right="200"/>
+      </w:pPr>
+      <w:r>
+        <w:rPr>
+          <w:rFonts w:ascii="Courier New" w:cs="Courier New" w:eastAsia="Courier New" w:hAnsi="Courier New"/>
+          <w:color w:val="1A4A7A"/>
+          <w:sz w:val="16"/>
+          <w:szCs w:val="16"/>
+        </w:rPr>
+        <w:t xml:space="preserve">      │   ├── GET /api/stats/trend       [evolución temporal]</w:t>
+      </w:r>
+    </w:p>
+    <w:p>
+      <w:pPr>
+        <w:shd w:fill="F0F8FF" w:val="clear"/>
+        <w:spacing w:after="0" w:before="0"/>
+        <w:ind w:left="200" w:right="200"/>
+      </w:pPr>
+      <w:r>
+        <w:rPr>
+          <w:rFonts w:ascii="Courier New" w:cs="Courier New" w:eastAsia="Courier New" w:hAnsi="Courier New"/>
+          <w:color w:val="1A4A7A"/>
+          <w:sz w:val="16"/>
+          <w:szCs w:val="16"/>
+        </w:rPr>
+        <w:t xml:space="preserve">      │   └── GET /api/stats/glossary    [glosario de métricas]</w:t>
+      </w:r>
+    </w:p>
+    <w:p>
+      <w:pPr>
+        <w:shd w:fill="F0F8FF" w:val="clear"/>
+        <w:spacing w:after="0" w:before="0"/>
+        <w:ind w:left="200" w:right="200"/>
+      </w:pPr>
+      <w:r>
+        <w:rPr>
+          <w:rFonts w:ascii="Courier New" w:cs="Courier New" w:eastAsia="Courier New" w:hAnsi="Courier New"/>
+          <w:color w:val="1A4A7A"/>
+          <w:sz w:val="16"/>
+          <w:szCs w:val="16"/>
+        </w:rPr>
+        <w:t xml:space="preserve">      │</w:t>
+      </w:r>
+    </w:p>
+    <w:p>
+      <w:pPr>
+        <w:shd w:fill="F0F8FF" w:val="clear"/>
+        <w:spacing w:after="0" w:before="0"/>
+        <w:ind w:left="200" w:right="200"/>
+      </w:pPr>
+      <w:r>
+        <w:rPr>
+          <w:rFonts w:ascii="Courier New" w:cs="Courier New" w:eastAsia="Courier New" w:hAnsi="Courier New"/>
+          <w:color w:val="1A4A7A"/>
+          <w:sz w:val="16"/>
+          <w:szCs w:val="16"/>
+        </w:rPr>
+        <w:t xml:space="preserve">      ├── players.py</w:t>
+      </w:r>
+    </w:p>
+    <w:p>
+      <w:pPr>
+        <w:shd w:fill="F0F8FF" w:val="clear"/>
+        <w:spacing w:after="0" w:before="0"/>
+        <w:ind w:left="200" w:right="200"/>
+      </w:pPr>
+      <w:r>
+        <w:rPr>
+          <w:rFonts w:ascii="Courier New" w:cs="Courier New" w:eastAsia="Courier New" w:hAnsi="Courier New"/>
+          <w:color w:val="1A4A7A"/>
+          <w:sz w:val="16"/>
+          <w:szCs w:val="16"/>
+        </w:rPr>
+        <w:t xml:space="preserve">      │   ├── GET /api/players                 [lista de jugadores]</w:t>
+      </w:r>
+    </w:p>
+    <w:p>
+      <w:pPr>
+        <w:shd w:fill="F0F8FF" w:val="clear"/>
+        <w:spacing w:after="0" w:before="0"/>
+        <w:ind w:left="200" w:right="200"/>
+      </w:pPr>
+      <w:r>
+        <w:rPr>
+          <w:rFonts w:ascii="Courier New" w:cs="Courier New" w:eastAsia="Courier New" w:hAnsi="Courier New"/>
+          <w:color w:val="1A4A7A"/>
+          <w:sz w:val="16"/>
+          <w:szCs w:val="16"/>
+        </w:rPr>
+        <w:t xml:space="preserve">      │   ├── GET /api/players/{name}/summary  [récord con/contra]</w:t>
+      </w:r>
+    </w:p>
+    <w:p>
+      <w:pPr>
+        <w:shd w:fill="F0F8FF" w:val="clear"/>
+        <w:spacing w:after="0" w:before="0"/>
+        <w:ind w:left="200" w:right="200"/>
+      </w:pPr>
+      <w:r>
+        <w:rPr>
+          <w:rFonts w:ascii="Courier New" w:cs="Courier New" w:eastAsia="Courier New" w:hAnsi="Courier New"/>
+          <w:color w:val="1A4A7A"/>
+          <w:sz w:val="16"/>
+          <w:szCs w:val="16"/>
+        </w:rPr>
+        <w:t xml:space="preserve">      │   └── GET /api/players/{name}/replays  [partidas del jugador]</w:t>
+      </w:r>
+    </w:p>
+    <w:p>
+      <w:pPr>
+        <w:shd w:fill="F0F8FF" w:val="clear"/>
+        <w:spacing w:after="0" w:before="0"/>
+        <w:ind w:left="200" w:right="200"/>
+      </w:pPr>
+      <w:r>
+        <w:rPr>
+          <w:rFonts w:ascii="Courier New" w:cs="Courier New" w:eastAsia="Courier New" w:hAnsi="Courier New"/>
+          <w:color w:val="1A4A7A"/>
+          <w:sz w:val="16"/>
+          <w:szCs w:val="16"/>
+        </w:rPr>
+        <w:t xml:space="preserve">      │</w:t>
+      </w:r>
+    </w:p>
+    <w:p>
+      <w:pPr>
+        <w:shd w:fill="F0F8FF" w:val="clear"/>
+        <w:spacing w:after="0" w:before="0"/>
+        <w:ind w:left="200" w:right="200"/>
+      </w:pPr>
+      <w:r>
+        <w:rPr>
+          <w:rFonts w:ascii="Courier New" w:cs="Courier New" w:eastAsia="Courier New" w:hAnsi="Courier New"/>
+          <w:color w:val="1A4A7A"/>
+          <w:sz w:val="16"/>
+          <w:szCs w:val="16"/>
+        </w:rPr>
+        <w:t xml:space="preserve">      ├── viewer.py</w:t>
+      </w:r>
+    </w:p>
+    <w:p>
+      <w:pPr>
+        <w:shd w:fill="F0F8FF" w:val="clear"/>
+        <w:spacing w:after="0" w:before="0"/>
+        <w:ind w:left="200" w:right="200"/>
+      </w:pPr>
+      <w:r>
+        <w:rPr>
+          <w:rFonts w:ascii="Courier New" w:cs="Courier New" w:eastAsia="Courier New" w:hAnsi="Courier New"/>
+          <w:color w:val="1A4A7A"/>
+          <w:sz w:val="16"/>
+          <w:szCs w:val="16"/>
+        </w:rPr>
+        <w:t xml:space="preserve">      │   └── GET /api/replays/{id}/ballchasing  [sube y abre en Ballchasing]</w:t>
       </w:r>
     </w:p>
     <w:p>
@@ -9682,7 +10366,13 @@
         <w:spacing w:after="120" w:before="0"/>
       </w:pPr>
       <w:r>
-        <w:t xml:space="preserve"/>
+        <w:rPr>
+          <w:rFonts w:ascii="Arial" w:cs="Arial" w:eastAsia="Arial" w:hAnsi="Arial"/>
+          <w:color w:val="222222"/>
+          <w:sz w:val="20"/>
+          <w:szCs w:val="20"/>
+        </w:rPr>
+        <w:t xml:space="preserve">Novedades v0.3.0: el router stats.py añade /api/stats/dashboard (datos del Dashboard), /api/stats/analysis (comparativa victorias/derrotas y por rol), /api/stats/trend (evolución temporal) y /api/stats/glossary (glosario de métricas). El router players.py expone el historial por jugador (/api/players, /api/players/{name}/summary y /api/players/{name}/replays). El router viewer.py añade /api/replays/{id}/ballchasing para abrir la partida en el visor embebido de Ballchasing.</w:t>
       </w:r>
     </w:p>
     <w:p>

</xml_diff>